<commit_message>
Fix consistency issues across icon and logo assets
Fixes a set of consistency issues across icon and logo assets All 36 icon SVGs' groups labelled in snake_case for editability. Profile pictures redesigned. Visual identity section updated to match. All PNG derivatives regenerated from the updated SVGs. Full session record in RESEARCH_LOG.md Entry 048; PROJECT_BRIEF.md's
</commit_message>
<xml_diff>
--- a/drafts/Effective_Prompting_Example.docx
+++ b/drafts/Effective_Prompting_Example.docx
@@ -644,8 +644,8 @@
                     <wps:cNvSpPr/>
                     <wps:spPr>
                       <a:xfrm>
-                        <a:off x="108000" y="180000"/>
-                        <a:ext cx="720000" cy="720000"/>
+                        <a:off x="108000" y="126000"/>
+                        <a:ext cx="828000" cy="828000"/>
                       </a:xfrm>
                       <a:prstGeom prst="roundRect">
                         <a:avLst>
@@ -674,8 +674,8 @@
                     </pic:blipFill>
                     <pic:spPr>
                       <a:xfrm>
-                        <a:off x="244800" y="316800"/>
-                        <a:ext cx="446400" cy="446400"/>
+                        <a:off x="199080" y="217080"/>
+                        <a:ext cx="645840" cy="645840"/>
                       </a:xfrm>
                       <a:prstGeom prst="rect">
                         <a:avLst/>
@@ -686,8 +686,8 @@
                     <wps:cNvSpPr/>
                     <wps:spPr>
                       <a:xfrm>
-                        <a:off x="972000" y="180000"/>
-                        <a:ext cx="57600" cy="720000"/>
+                        <a:off x="1080000" y="126000"/>
+                        <a:ext cx="57600" cy="828000"/>
                       </a:xfrm>
                       <a:prstGeom prst="roundRect">
                         <a:avLst>
@@ -707,8 +707,8 @@
                     <wps:cNvSpPr/>
                     <wps:spPr>
                       <a:xfrm>
-                        <a:off x="1173600" y="108000"/>
-                        <a:ext cx="3326400" cy="864000"/>
+                        <a:off x="1281600" y="108000"/>
+                        <a:ext cx="3218400" cy="864000"/>
                       </a:xfrm>
                       <a:prstGeom prst="rect">
                         <a:avLst/>
@@ -811,8 +811,8 @@
                     <wps:cNvSpPr/>
                     <wps:spPr>
                       <a:xfrm>
-                        <a:off x="108000" y="180000"/>
-                        <a:ext cx="720000" cy="720000"/>
+                        <a:off x="108000" y="126000"/>
+                        <a:ext cx="828000" cy="828000"/>
                       </a:xfrm>
                       <a:prstGeom prst="roundRect">
                         <a:avLst>
@@ -841,8 +841,8 @@
                     </pic:blipFill>
                     <pic:spPr>
                       <a:xfrm>
-                        <a:off x="244800" y="316800"/>
-                        <a:ext cx="446400" cy="446400"/>
+                        <a:off x="199080" y="217080"/>
+                        <a:ext cx="645840" cy="645840"/>
                       </a:xfrm>
                       <a:prstGeom prst="rect">
                         <a:avLst/>
@@ -853,8 +853,8 @@
                     <wps:cNvSpPr/>
                     <wps:spPr>
                       <a:xfrm>
-                        <a:off x="972000" y="180000"/>
-                        <a:ext cx="57600" cy="720000"/>
+                        <a:off x="1080000" y="126000"/>
+                        <a:ext cx="57600" cy="828000"/>
                       </a:xfrm>
                       <a:prstGeom prst="roundRect">
                         <a:avLst>
@@ -874,8 +874,8 @@
                     <wps:cNvSpPr/>
                     <wps:spPr>
                       <a:xfrm>
-                        <a:off x="1173600" y="108000"/>
-                        <a:ext cx="3326400" cy="864000"/>
+                        <a:off x="1281600" y="108000"/>
+                        <a:ext cx="3218400" cy="864000"/>
                       </a:xfrm>
                       <a:prstGeom prst="rect">
                         <a:avLst/>
@@ -1239,8 +1239,8 @@
                     <wps:cNvSpPr/>
                     <wps:spPr>
                       <a:xfrm>
-                        <a:off x="108000" y="288000"/>
-                        <a:ext cx="720000" cy="720000"/>
+                        <a:off x="108000" y="234000"/>
+                        <a:ext cx="828000" cy="828000"/>
                       </a:xfrm>
                       <a:prstGeom prst="roundRect">
                         <a:avLst>
@@ -1269,8 +1269,8 @@
                     </pic:blipFill>
                     <pic:spPr>
                       <a:xfrm>
-                        <a:off x="244800" y="424800"/>
-                        <a:ext cx="446400" cy="446400"/>
+                        <a:off x="199080" y="325080"/>
+                        <a:ext cx="645840" cy="645840"/>
                       </a:xfrm>
                       <a:prstGeom prst="rect">
                         <a:avLst/>
@@ -1281,8 +1281,8 @@
                     <wps:cNvSpPr/>
                     <wps:spPr>
                       <a:xfrm>
-                        <a:off x="972000" y="288000"/>
-                        <a:ext cx="57600" cy="720000"/>
+                        <a:off x="1080000" y="234000"/>
+                        <a:ext cx="57600" cy="828000"/>
                       </a:xfrm>
                       <a:prstGeom prst="roundRect">
                         <a:avLst>
@@ -1302,8 +1302,8 @@
                     <wps:cNvSpPr/>
                     <wps:spPr>
                       <a:xfrm>
-                        <a:off x="1173600" y="108000"/>
-                        <a:ext cx="4406400" cy="1080000"/>
+                        <a:off x="1281600" y="108000"/>
+                        <a:ext cx="4298400" cy="1080000"/>
                       </a:xfrm>
                       <a:prstGeom prst="rect">
                         <a:avLst/>

</xml_diff>